<commit_message>
Trim Generative AI Statement; rebuild PDF and DOCX
</commit_message>
<xml_diff>
--- a/frontiers/manuscript.docx
+++ b/frontiers/manuscript.docx
@@ -3047,7 +3047,7 @@
         <w:pStyle w:val="FirstParagraph"/>
       </w:pPr>
       <w:r>
-        <w:t xml:space="preserve">The analytical workflow was pre-registered through a hashed pre-analysis plan prior to final estimation detailing the core sample construction, disclosure taxonomy, primary estimands, procedures for assessing reliability, and procedures for assessing robustness. The replication package includes the 307-incident matched dataset, disclosure classifications, severity coding, issuer-matching crosswalk, filing-search records, disagreement log, pre-analysis documentation, and analysis code to reproduce the reported tables, figures, and statistical results. The researchers defined the disclosure codebook and classification rules, and all entity matches, filing evidence, incident classifications, and final statistical outputs were validated. Each of the reported disclosure classifications can be traced back to the underlying source filing. The main results were independently re-derived using the final data. A generative-AI system (Anthropic Claude, Opus-class model, accessed August 2026 via the Claude Agent SDK) assisted with software scaffolding and coding of these scripts and with language editing, under author validation; all study design, entity resolution, incident classification, and interpretation were performed by the authors (see the Generative AI Statement).</w:t>
+        <w:t xml:space="preserve">The analytical workflow was pre-registered through a hashed pre-analysis plan prior to final estimation detailing the core sample construction, disclosure taxonomy, primary estimands, procedures for assessing reliability, and procedures for assessing robustness. The replication package includes the 307-incident matched dataset, disclosure classifications, severity coding, issuer-matching crosswalk, filing-search records, disagreement log, pre-analysis documentation, and analysis code to reproduce the reported tables, figures, and statistical results. The researchers defined the disclosure codebook and classification rules, and all entity matches, filing evidence, incident classifications, and final statistical outputs were validated. Each of the reported disclosure classifications can be traced back to the underlying source filing. The main results were independently re-derived using the final data. A generative-AI system (Anthropic Claude, Opus-class model, accessed August 2026 via the Claude Agent SDK) assisted with software scaffolding, coding and code review, and minor grammar edits, under author validation; all study design, entity resolution, incident classification, and interpretation were performed by the authors (see the Generative AI Statement).</w:t>
       </w:r>
     </w:p>
     <w:bookmarkEnd w:id="31"/>
@@ -3704,7 +3704,7 @@
         <w:pStyle w:val="FirstParagraph"/>
       </w:pPr>
       <w:r>
-        <w:t xml:space="preserve">The authors declare that a generative-AI system (Anthropic Claude, Opus-class model, accessed August 2026 via the Claude Agent SDK) was used to assist with software scaffolding and coding of the analysis pipeline and with language editing and drafting of the manuscript, in all cases under the authors’ direction (see also Materials and Methods and the Acknowledgments). It was not used for the study design, data analysis, or interpretation of the results, and the authors take full responsibility for all content. No generative-AI system is listed as an author.</w:t>
+        <w:t xml:space="preserve">The authors declare that a generative-AI system (Anthropic Claude, Opus-class model, accessed August 2026 via the Claude Agent SDK) was used for software scaffolding, coding and code review, and minor grammar edits, in all cases under the authors’ direction. It was not used for study design, data analysis, or interpretation of the results, and the authors take full responsibility for all content. No generative-AI system is listed as an author.</w:t>
       </w:r>
     </w:p>
     <w:bookmarkEnd w:id="47"/>
@@ -3722,7 +3722,7 @@
         <w:pStyle w:val="FirstParagraph"/>
       </w:pPr>
       <w:r>
-        <w:t xml:space="preserve">Software scaffolding and coding of the analysis and verification pipeline, and language editing of the manuscript, were assisted by a generative-AI system (Anthropic Claude, Opus-class model, accessed August 2026 via the Claude Agent SDK) under author validation; see the Generative AI Statement. The corresponding author is responsible for the accuracy of all content, citations, and references.</w:t>
+        <w:t xml:space="preserve">Software scaffolding, coding and code review, and minor grammar edits were assisted by a generative-AI system (Anthropic Claude, Opus-class model, accessed August 2026 via the Claude Agent SDK) under author validation; see the Generative AI Statement. The corresponding author is responsible for the accuracy of all content, citations, and references.</w:t>
       </w:r>
     </w:p>
     <w:bookmarkEnd w:id="48"/>

</xml_diff>